<commit_message>
fix: Noto Sans CJK SC 字体，中文正常
</commit_message>
<xml_diff>
--- a/ceara-rural-water-supply-analysis.docx
+++ b/ceara-rural-water-supply-analysis.docx
@@ -7,6 +7,9 @@
         <w:pStyle w:val="Heading1"/>
       </w:pPr>
       <w:r>
+        <w:rPr>
+          <w:rFonts w:ascii="Noto Sans CJK SC" w:hAnsi="Noto Sans CJK SC" w:eastAsia="Noto Sans CJK SC"/>
+        </w:rPr>
         <w:t>项目投标分析与建议书</w:t>
       </w:r>
     </w:p>
@@ -15,6 +18,9 @@
         <w:pStyle w:val="Heading2"/>
       </w:pPr>
       <w:r>
+        <w:rPr>
+          <w:rFonts w:ascii="Noto Sans CJK SC" w:hAnsi="Noto Sans CJK SC" w:eastAsia="Noto Sans CJK SC"/>
+        </w:rPr>
         <w:t>一、项目基本信息</w:t>
       </w:r>
     </w:p>
@@ -37,7 +43,7 @@
           <w:p>
             <w:r>
               <w:rPr>
-                <w:rFonts w:ascii="SimSun" w:hAnsi="SimSun" w:eastAsia="SimSun"/>
+                <w:rFonts w:ascii="Noto Sans CJK SC" w:hAnsi="Noto Sans CJK SC" w:eastAsia="Noto Sans CJK SC"/>
                 <w:b/>
                 <w:sz w:val="20"/>
               </w:rPr>
@@ -52,7 +58,7 @@
           <w:p>
             <w:r>
               <w:rPr>
-                <w:rFonts w:ascii="SimSun" w:hAnsi="SimSun" w:eastAsia="SimSun"/>
+                <w:rFonts w:ascii="Noto Sans CJK SC" w:hAnsi="Noto Sans CJK SC" w:eastAsia="Noto Sans CJK SC"/>
                 <w:b/>
                 <w:sz w:val="20"/>
               </w:rPr>
@@ -69,7 +75,8 @@
           <w:p>
             <w:r>
               <w:rPr>
-                <w:rFonts w:ascii="SimSun" w:hAnsi="SimSun" w:eastAsia="SimSun"/>
+                <w:rFonts w:ascii="Noto Sans CJK SC" w:hAnsi="Noto Sans CJK SC" w:eastAsia="Noto Sans CJK SC"/>
+                <w:b w:val="0"/>
                 <w:sz w:val="20"/>
               </w:rPr>
               <w:t>项目名称</w:t>
@@ -83,7 +90,8 @@
           <w:p>
             <w:r>
               <w:rPr>
-                <w:rFonts w:ascii="SimSun" w:hAnsi="SimSun" w:eastAsia="SimSun"/>
+                <w:rFonts w:ascii="Noto Sans CJK SC" w:hAnsi="Noto Sans CJK SC" w:eastAsia="Noto Sans CJK SC"/>
+                <w:b w:val="0"/>
                 <w:sz w:val="20"/>
               </w:rPr>
               <w:t>Ceara Rural Sustainable Development and Competitiveness Phase II</w:t>
@@ -99,7 +107,8 @@
           <w:p>
             <w:r>
               <w:rPr>
-                <w:rFonts w:ascii="SimSun" w:hAnsi="SimSun" w:eastAsia="SimSun"/>
+                <w:rFonts w:ascii="Noto Sans CJK SC" w:hAnsi="Noto Sans CJK SC" w:eastAsia="Noto Sans CJK SC"/>
+                <w:b w:val="0"/>
                 <w:sz w:val="20"/>
               </w:rPr>
               <w:t>项目ID</w:t>
@@ -113,7 +122,8 @@
           <w:p>
             <w:r>
               <w:rPr>
-                <w:rFonts w:ascii="SimSun" w:hAnsi="SimSun" w:eastAsia="SimSun"/>
+                <w:rFonts w:ascii="Noto Sans CJK SC" w:hAnsi="Noto Sans CJK SC" w:eastAsia="Noto Sans CJK SC"/>
+                <w:b w:val="0"/>
                 <w:sz w:val="20"/>
               </w:rPr>
               <w:t>P167455</w:t>
@@ -129,7 +139,8 @@
           <w:p>
             <w:r>
               <w:rPr>
-                <w:rFonts w:ascii="SimSun" w:hAnsi="SimSun" w:eastAsia="SimSun"/>
+                <w:rFonts w:ascii="Noto Sans CJK SC" w:hAnsi="Noto Sans CJK SC" w:eastAsia="Noto Sans CJK SC"/>
+                <w:b w:val="0"/>
                 <w:sz w:val="20"/>
               </w:rPr>
               <w:t>资金来源</w:t>
@@ -143,7 +154,8 @@
           <w:p>
             <w:r>
               <w:rPr>
-                <w:rFonts w:ascii="SimSun" w:hAnsi="SimSun" w:eastAsia="SimSun"/>
+                <w:rFonts w:ascii="Noto Sans CJK SC" w:hAnsi="Noto Sans CJK SC" w:eastAsia="Noto Sans CJK SC"/>
+                <w:b w:val="0"/>
                 <w:sz w:val="20"/>
               </w:rPr>
               <w:t>世界银行（IBRD）</w:t>
@@ -159,7 +171,8 @@
           <w:p>
             <w:r>
               <w:rPr>
-                <w:rFonts w:ascii="SimSun" w:hAnsi="SimSun" w:eastAsia="SimSun"/>
+                <w:rFonts w:ascii="Noto Sans CJK SC" w:hAnsi="Noto Sans CJK SC" w:eastAsia="Noto Sans CJK SC"/>
+                <w:b w:val="0"/>
                 <w:sz w:val="20"/>
               </w:rPr>
               <w:t>贷款金额</w:t>
@@ -173,7 +186,8 @@
           <w:p>
             <w:r>
               <w:rPr>
-                <w:rFonts w:ascii="SimSun" w:hAnsi="SimSun" w:eastAsia="SimSun"/>
+                <w:rFonts w:ascii="Noto Sans CJK SC" w:hAnsi="Noto Sans CJK SC" w:eastAsia="Noto Sans CJK SC"/>
+                <w:b w:val="0"/>
                 <w:sz w:val="20"/>
               </w:rPr>
               <w:t>US$ 100,000,000（世界银行）+ US$ 53,530,000（巴西政府配套）</w:t>
@@ -189,7 +203,8 @@
           <w:p>
             <w:r>
               <w:rPr>
-                <w:rFonts w:ascii="SimSun" w:hAnsi="SimSun" w:eastAsia="SimSun"/>
+                <w:rFonts w:ascii="Noto Sans CJK SC" w:hAnsi="Noto Sans CJK SC" w:eastAsia="Noto Sans CJK SC"/>
+                <w:b w:val="0"/>
                 <w:sz w:val="20"/>
               </w:rPr>
               <w:t>项目总预算</w:t>
@@ -203,7 +218,8 @@
           <w:p>
             <w:r>
               <w:rPr>
-                <w:rFonts w:ascii="SimSun" w:hAnsi="SimSun" w:eastAsia="SimSun"/>
+                <w:rFonts w:ascii="Noto Sans CJK SC" w:hAnsi="Noto Sans CJK SC" w:eastAsia="Noto Sans CJK SC"/>
+                <w:b w:val="0"/>
                 <w:sz w:val="20"/>
               </w:rPr>
               <w:t>US$ 153,530,000 ≈ 11.1 亿人民币</w:t>
@@ -219,7 +235,8 @@
           <w:p>
             <w:r>
               <w:rPr>
-                <w:rFonts w:ascii="SimSun" w:hAnsi="SimSun" w:eastAsia="SimSun"/>
+                <w:rFonts w:ascii="Noto Sans CJK SC" w:hAnsi="Noto Sans CJK SC" w:eastAsia="Noto Sans CJK SC"/>
+                <w:b w:val="0"/>
                 <w:sz w:val="20"/>
               </w:rPr>
               <w:t>实施机构</w:t>
@@ -233,7 +250,8 @@
           <w:p>
             <w:r>
               <w:rPr>
-                <w:rFonts w:ascii="SimSun" w:hAnsi="SimSun" w:eastAsia="SimSun"/>
+                <w:rFonts w:ascii="Noto Sans CJK SC" w:hAnsi="Noto Sans CJK SC" w:eastAsia="Noto Sans CJK SC"/>
+                <w:b w:val="0"/>
                 <w:sz w:val="20"/>
               </w:rPr>
               <w:t>Secretariat of Agrarian Development（塞阿拉州农业发展厅）</w:t>
@@ -249,7 +267,8 @@
           <w:p>
             <w:r>
               <w:rPr>
-                <w:rFonts w:ascii="SimSun" w:hAnsi="SimSun" w:eastAsia="SimSun"/>
+                <w:rFonts w:ascii="Noto Sans CJK SC" w:hAnsi="Noto Sans CJK SC" w:eastAsia="Noto Sans CJK SC"/>
+                <w:b w:val="0"/>
                 <w:sz w:val="20"/>
               </w:rPr>
               <w:t>国家/地区</w:t>
@@ -263,7 +282,8 @@
           <w:p>
             <w:r>
               <w:rPr>
-                <w:rFonts w:ascii="SimSun" w:hAnsi="SimSun" w:eastAsia="SimSun"/>
+                <w:rFonts w:ascii="Noto Sans CJK SC" w:hAnsi="Noto Sans CJK SC" w:eastAsia="Noto Sans CJK SC"/>
+                <w:b w:val="0"/>
                 <w:sz w:val="20"/>
               </w:rPr>
               <w:t>巴西 · 塞阿拉州（Latin America and Caribbean）</w:t>
@@ -279,7 +299,8 @@
           <w:p>
             <w:r>
               <w:rPr>
-                <w:rFonts w:ascii="SimSun" w:hAnsi="SimSun" w:eastAsia="SimSun"/>
+                <w:rFonts w:ascii="Noto Sans CJK SC" w:hAnsi="Noto Sans CJK SC" w:eastAsia="Noto Sans CJK SC"/>
+                <w:b w:val="0"/>
                 <w:sz w:val="20"/>
               </w:rPr>
               <w:t>项目周期</w:t>
@@ -293,7 +314,8 @@
           <w:p>
             <w:r>
               <w:rPr>
-                <w:rFonts w:ascii="SimSun" w:hAnsi="SimSun" w:eastAsia="SimSun"/>
+                <w:rFonts w:ascii="Noto Sans CJK SC" w:hAnsi="Noto Sans CJK SC" w:eastAsia="Noto Sans CJK SC"/>
+                <w:b w:val="0"/>
                 <w:sz w:val="20"/>
               </w:rPr>
               <w:t>2020年4月 — 2027年9月30日（还剩约16个月）</w:t>
@@ -309,7 +331,8 @@
           <w:p>
             <w:r>
               <w:rPr>
-                <w:rFonts w:ascii="SimSun" w:hAnsi="SimSun" w:eastAsia="SimSun"/>
+                <w:rFonts w:ascii="Noto Sans CJK SC" w:hAnsi="Noto Sans CJK SC" w:eastAsia="Noto Sans CJK SC"/>
+                <w:b w:val="0"/>
                 <w:sz w:val="20"/>
               </w:rPr>
               <w:t>环境类别</w:t>
@@ -323,7 +346,8 @@
           <w:p>
             <w:r>
               <w:rPr>
-                <w:rFonts w:ascii="SimSun" w:hAnsi="SimSun" w:eastAsia="SimSun"/>
+                <w:rFonts w:ascii="Noto Sans CJK SC" w:hAnsi="Noto Sans CJK SC" w:eastAsia="Noto Sans CJK SC"/>
+                <w:b w:val="0"/>
                 <w:sz w:val="20"/>
               </w:rPr>
               <w:t>B 类</w:t>
@@ -339,7 +363,8 @@
           <w:p>
             <w:r>
               <w:rPr>
-                <w:rFonts w:ascii="SimSun" w:hAnsi="SimSun" w:eastAsia="SimSun"/>
+                <w:rFonts w:ascii="Noto Sans CJK SC" w:hAnsi="Noto Sans CJK SC" w:eastAsia="Noto Sans CJK SC"/>
+                <w:b w:val="0"/>
                 <w:sz w:val="20"/>
               </w:rPr>
               <w:t>项目经理</w:t>
@@ -353,7 +378,8 @@
           <w:p>
             <w:r>
               <w:rPr>
-                <w:rFonts w:ascii="SimSun" w:hAnsi="SimSun" w:eastAsia="SimSun"/>
+                <w:rFonts w:ascii="Noto Sans CJK SC" w:hAnsi="Noto Sans CJK SC" w:eastAsia="Noto Sans CJK SC"/>
+                <w:b w:val="0"/>
                 <w:sz w:val="20"/>
               </w:rPr>
               <w:t>Marie Paviot</w:t>
@@ -368,6 +394,9 @@
         <w:pStyle w:val="Heading2"/>
       </w:pPr>
       <w:r>
+        <w:rPr>
+          <w:rFonts w:ascii="Noto Sans CJK SC" w:hAnsi="Noto Sans CJK SC" w:eastAsia="Noto Sans CJK SC"/>
+        </w:rPr>
         <w:t>二、本次招标标的详情</w:t>
       </w:r>
     </w:p>
@@ -390,7 +419,7 @@
           <w:p>
             <w:r>
               <w:rPr>
-                <w:rFonts w:ascii="SimSun" w:hAnsi="SimSun" w:eastAsia="SimSun"/>
+                <w:rFonts w:ascii="Noto Sans CJK SC" w:hAnsi="Noto Sans CJK SC" w:eastAsia="Noto Sans CJK SC"/>
                 <w:b/>
                 <w:sz w:val="20"/>
               </w:rPr>
@@ -405,7 +434,7 @@
           <w:p>
             <w:r>
               <w:rPr>
-                <w:rFonts w:ascii="SimSun" w:hAnsi="SimSun" w:eastAsia="SimSun"/>
+                <w:rFonts w:ascii="Noto Sans CJK SC" w:hAnsi="Noto Sans CJK SC" w:eastAsia="Noto Sans CJK SC"/>
                 <w:b/>
                 <w:sz w:val="20"/>
               </w:rPr>
@@ -422,7 +451,8 @@
           <w:p>
             <w:r>
               <w:rPr>
-                <w:rFonts w:ascii="SimSun" w:hAnsi="SimSun" w:eastAsia="SimSun"/>
+                <w:rFonts w:ascii="Noto Sans CJK SC" w:hAnsi="Noto Sans CJK SC" w:eastAsia="Noto Sans CJK SC"/>
+                <w:b w:val="0"/>
                 <w:sz w:val="20"/>
               </w:rPr>
               <w:t>招标类型</w:t>
@@ -436,7 +466,8 @@
           <w:p>
             <w:r>
               <w:rPr>
-                <w:rFonts w:ascii="SimSun" w:hAnsi="SimSun" w:eastAsia="SimSun"/>
+                <w:rFonts w:ascii="Noto Sans CJK SC" w:hAnsi="Noto Sans CJK SC" w:eastAsia="Noto Sans CJK SC"/>
+                <w:b w:val="0"/>
                 <w:sz w:val="20"/>
               </w:rPr>
               <w:t>Invitation for Bids（投标邀请）</w:t>
@@ -452,7 +483,8 @@
           <w:p>
             <w:r>
               <w:rPr>
-                <w:rFonts w:ascii="SimSun" w:hAnsi="SimSun" w:eastAsia="SimSun"/>
+                <w:rFonts w:ascii="Noto Sans CJK SC" w:hAnsi="Noto Sans CJK SC" w:eastAsia="Noto Sans CJK SC"/>
+                <w:b w:val="0"/>
                 <w:sz w:val="20"/>
               </w:rPr>
               <w:t>发布日期</w:t>
@@ -466,7 +498,8 @@
           <w:p>
             <w:r>
               <w:rPr>
-                <w:rFonts w:ascii="SimSun" w:hAnsi="SimSun" w:eastAsia="SimSun"/>
+                <w:rFonts w:ascii="Noto Sans CJK SC" w:hAnsi="Noto Sans CJK SC" w:eastAsia="Noto Sans CJK SC"/>
+                <w:b w:val="0"/>
                 <w:sz w:val="20"/>
               </w:rPr>
               <w:t>2026年5月8日</w:t>
@@ -482,7 +515,8 @@
           <w:p>
             <w:r>
               <w:rPr>
-                <w:rFonts w:ascii="SimSun" w:hAnsi="SimSun" w:eastAsia="SimSun"/>
+                <w:rFonts w:ascii="Noto Sans CJK SC" w:hAnsi="Noto Sans CJK SC" w:eastAsia="Noto Sans CJK SC"/>
+                <w:b w:val="0"/>
                 <w:sz w:val="20"/>
               </w:rPr>
               <w:t>标的名称</w:t>
@@ -496,10 +530,11 @@
           <w:p>
             <w:r>
               <w:rPr>
-                <w:rFonts w:ascii="SimSun" w:hAnsi="SimSun" w:eastAsia="SimSun"/>
+                <w:rFonts w:ascii="Noto Sans CJK SC" w:hAnsi="Noto Sans CJK SC" w:eastAsia="Noto Sans CJK SC"/>
+                <w:b w:val="0"/>
                 <w:sz w:val="20"/>
               </w:rPr>
-              <w:t>农村供水系统建设工程（Civil Works）—— 含材料供应与安装</w:t>
+              <w:t>农村供水系统建设工程（Civil Works）——含材料供应与安装</w:t>
             </w:r>
           </w:p>
         </w:tc>
@@ -512,7 +547,8 @@
           <w:p>
             <w:r>
               <w:rPr>
-                <w:rFonts w:ascii="SimSun" w:hAnsi="SimSun" w:eastAsia="SimSun"/>
+                <w:rFonts w:ascii="Noto Sans CJK SC" w:hAnsi="Noto Sans CJK SC" w:eastAsia="Noto Sans CJK SC"/>
+                <w:b w:val="0"/>
                 <w:sz w:val="20"/>
               </w:rPr>
               <w:t>工作范围</w:t>
@@ -526,10 +562,11 @@
           <w:p>
             <w:r>
               <w:rPr>
-                <w:rFonts w:ascii="SimSun" w:hAnsi="SimSun" w:eastAsia="SimSun"/>
+                <w:rFonts w:ascii="Noto Sans CJK SC" w:hAnsi="Noto Sans CJK SC" w:eastAsia="Noto Sans CJK SC"/>
+                <w:b w:val="0"/>
                 <w:sz w:val="20"/>
               </w:rPr>
-              <w:t>① 农村供水系统建设（含管网铺设、储水设施）② 卫生模块（卫生厕所）建设 ③ 配套材料采购与安装</w:t>
+              <w:t>①农村供水系统建设（含管网铺设、储水设施）②卫生模块（卫生厕所）建设 ③配套材料采购与安装</w:t>
             </w:r>
           </w:p>
         </w:tc>
@@ -542,7 +579,8 @@
           <w:p>
             <w:r>
               <w:rPr>
-                <w:rFonts w:ascii="SimSun" w:hAnsi="SimSun" w:eastAsia="SimSun"/>
+                <w:rFonts w:ascii="Noto Sans CJK SC" w:hAnsi="Noto Sans CJK SC" w:eastAsia="Noto Sans CJK SC"/>
+                <w:b w:val="0"/>
                 <w:sz w:val="20"/>
               </w:rPr>
               <w:t>投标语言</w:t>
@@ -556,7 +594,8 @@
           <w:p>
             <w:r>
               <w:rPr>
-                <w:rFonts w:ascii="SimSun" w:hAnsi="SimSun" w:eastAsia="SimSun"/>
+                <w:rFonts w:ascii="Noto Sans CJK SC" w:hAnsi="Noto Sans CJK SC" w:eastAsia="Noto Sans CJK SC"/>
+                <w:b w:val="0"/>
                 <w:sz w:val="20"/>
               </w:rPr>
               <w:t>葡萄牙语</w:t>
@@ -572,7 +611,8 @@
           <w:p>
             <w:r>
               <w:rPr>
-                <w:rFonts w:ascii="SimSun" w:hAnsi="SimSun" w:eastAsia="SimSun"/>
+                <w:rFonts w:ascii="Noto Sans CJK SC" w:hAnsi="Noto Sans CJK SC" w:eastAsia="Noto Sans CJK SC"/>
+                <w:b w:val="0"/>
                 <w:sz w:val="20"/>
               </w:rPr>
               <w:t>状态</w:t>
@@ -586,7 +626,8 @@
           <w:p>
             <w:r>
               <w:rPr>
-                <w:rFonts w:ascii="SimSun" w:hAnsi="SimSun" w:eastAsia="SimSun"/>
+                <w:rFonts w:ascii="Noto Sans CJK SC" w:hAnsi="Noto Sans CJK SC" w:eastAsia="Noto Sans CJK SC"/>
+                <w:b w:val="0"/>
                 <w:sz w:val="20"/>
               </w:rPr>
               <w:t>已发布</w:t>
@@ -601,13 +642,17 @@
         <w:pStyle w:val="Heading2"/>
       </w:pPr>
       <w:r>
+        <w:rPr>
+          <w:rFonts w:ascii="Noto Sans CJK SC" w:hAnsi="Noto Sans CJK SC" w:eastAsia="Noto Sans CJK SC"/>
+        </w:rPr>
         <w:t>三、项目背景与评估</w:t>
       </w:r>
     </w:p>
     <w:p>
+      <w:pPr/>
       <w:r>
         <w:rPr>
-          <w:rFonts w:ascii="SimSun" w:hAnsi="SimSun" w:eastAsia="SimSun"/>
+          <w:rFonts w:ascii="Noto Sans CJK SC" w:hAnsi="Noto Sans CJK SC" w:eastAsia="Noto Sans CJK SC"/>
           <w:b w:val="0"/>
           <w:sz w:val="22"/>
         </w:rPr>
@@ -615,9 +660,10 @@
       </w:r>
     </w:p>
     <w:p>
+      <w:pPr/>
       <w:r>
         <w:rPr>
-          <w:rFonts w:ascii="SimSun" w:hAnsi="SimSun" w:eastAsia="SimSun"/>
+          <w:rFonts w:ascii="Noto Sans CJK SC" w:hAnsi="Noto Sans CJK SC" w:eastAsia="Noto Sans CJK SC"/>
           <w:b w:val="0"/>
           <w:sz w:val="22"/>
         </w:rPr>
@@ -643,7 +689,7 @@
           <w:p>
             <w:r>
               <w:rPr>
-                <w:rFonts w:ascii="SimSun" w:hAnsi="SimSun" w:eastAsia="SimSun"/>
+                <w:rFonts w:ascii="Noto Sans CJK SC" w:hAnsi="Noto Sans CJK SC" w:eastAsia="Noto Sans CJK SC"/>
                 <w:b/>
                 <w:sz w:val="20"/>
               </w:rPr>
@@ -658,7 +704,7 @@
           <w:p>
             <w:r>
               <w:rPr>
-                <w:rFonts w:ascii="SimSun" w:hAnsi="SimSun" w:eastAsia="SimSun"/>
+                <w:rFonts w:ascii="Noto Sans CJK SC" w:hAnsi="Noto Sans CJK SC" w:eastAsia="Noto Sans CJK SC"/>
                 <w:b/>
                 <w:sz w:val="20"/>
               </w:rPr>
@@ -675,7 +721,8 @@
           <w:p>
             <w:r>
               <w:rPr>
-                <w:rFonts w:ascii="SimSun" w:hAnsi="SimSun" w:eastAsia="SimSun"/>
+                <w:rFonts w:ascii="Noto Sans CJK SC" w:hAnsi="Noto Sans CJK SC" w:eastAsia="Noto Sans CJK SC"/>
+                <w:b w:val="0"/>
                 <w:sz w:val="20"/>
               </w:rPr>
               <w:t>整体实施进度</w:t>
@@ -689,7 +736,8 @@
           <w:p>
             <w:r>
               <w:rPr>
-                <w:rFonts w:ascii="SimSun" w:hAnsi="SimSun" w:eastAsia="SimSun"/>
+                <w:rFonts w:ascii="Noto Sans CJK SC" w:hAnsi="Noto Sans CJK SC" w:eastAsia="Noto Sans CJK SC"/>
+                <w:b w:val="0"/>
                 <w:sz w:val="20"/>
               </w:rPr>
               <w:t>满意（Satisfactory）</w:t>
@@ -705,7 +753,8 @@
           <w:p>
             <w:r>
               <w:rPr>
-                <w:rFonts w:ascii="SimSun" w:hAnsi="SimSun" w:eastAsia="SimSun"/>
+                <w:rFonts w:ascii="Noto Sans CJK SC" w:hAnsi="Noto Sans CJK SC" w:eastAsia="Noto Sans CJK SC"/>
+                <w:b w:val="0"/>
                 <w:sz w:val="20"/>
               </w:rPr>
               <w:t>PDO 实现进度</w:t>
@@ -719,7 +768,8 @@
           <w:p>
             <w:r>
               <w:rPr>
-                <w:rFonts w:ascii="SimSun" w:hAnsi="SimSun" w:eastAsia="SimSun"/>
+                <w:rFonts w:ascii="Noto Sans CJK SC" w:hAnsi="Noto Sans CJK SC" w:eastAsia="Noto Sans CJK SC"/>
+                <w:b w:val="0"/>
                 <w:sz w:val="20"/>
               </w:rPr>
               <w:t>中等满意</w:t>
@@ -735,7 +785,8 @@
           <w:p>
             <w:r>
               <w:rPr>
-                <w:rFonts w:ascii="SimSun" w:hAnsi="SimSun" w:eastAsia="SimSun"/>
+                <w:rFonts w:ascii="Noto Sans CJK SC" w:hAnsi="Noto Sans CJK SC" w:eastAsia="Noto Sans CJK SC"/>
+                <w:b w:val="0"/>
                 <w:sz w:val="20"/>
               </w:rPr>
               <w:t>财务管理</w:t>
@@ -749,7 +800,8 @@
           <w:p>
             <w:r>
               <w:rPr>
-                <w:rFonts w:ascii="SimSun" w:hAnsi="SimSun" w:eastAsia="SimSun"/>
+                <w:rFonts w:ascii="Noto Sans CJK SC" w:hAnsi="Noto Sans CJK SC" w:eastAsia="Noto Sans CJK SC"/>
+                <w:b w:val="0"/>
                 <w:sz w:val="20"/>
               </w:rPr>
               <w:t>中等满意</w:t>
@@ -765,7 +817,8 @@
           <w:p>
             <w:r>
               <w:rPr>
-                <w:rFonts w:ascii="SimSun" w:hAnsi="SimSun" w:eastAsia="SimSun"/>
+                <w:rFonts w:ascii="Noto Sans CJK SC" w:hAnsi="Noto Sans CJK SC" w:eastAsia="Noto Sans CJK SC"/>
+                <w:b w:val="0"/>
                 <w:sz w:val="20"/>
               </w:rPr>
               <w:t>采购管理</w:t>
@@ -779,7 +832,8 @@
           <w:p>
             <w:r>
               <w:rPr>
-                <w:rFonts w:ascii="SimSun" w:hAnsi="SimSun" w:eastAsia="SimSun"/>
+                <w:rFonts w:ascii="Noto Sans CJK SC" w:hAnsi="Noto Sans CJK SC" w:eastAsia="Noto Sans CJK SC"/>
+                <w:b w:val="0"/>
                 <w:sz w:val="20"/>
               </w:rPr>
               <w:t>中等满意</w:t>
@@ -795,7 +849,8 @@
           <w:p>
             <w:r>
               <w:rPr>
-                <w:rFonts w:ascii="SimSun" w:hAnsi="SimSun" w:eastAsia="SimSun"/>
+                <w:rFonts w:ascii="Noto Sans CJK SC" w:hAnsi="Noto Sans CJK SC" w:eastAsia="Noto Sans CJK SC"/>
+                <w:b w:val="0"/>
                 <w:sz w:val="20"/>
               </w:rPr>
               <w:t>项目监测与评估</w:t>
@@ -809,7 +864,8 @@
           <w:p>
             <w:r>
               <w:rPr>
-                <w:rFonts w:ascii="SimSun" w:hAnsi="SimSun" w:eastAsia="SimSun"/>
+                <w:rFonts w:ascii="Noto Sans CJK SC" w:hAnsi="Noto Sans CJK SC" w:eastAsia="Noto Sans CJK SC"/>
+                <w:b w:val="0"/>
                 <w:sz w:val="20"/>
               </w:rPr>
               <w:t>满意</w:t>
@@ -825,7 +881,8 @@
           <w:p>
             <w:r>
               <w:rPr>
-                <w:rFonts w:ascii="SimSun" w:hAnsi="SimSun" w:eastAsia="SimSun"/>
+                <w:rFonts w:ascii="Noto Sans CJK SC" w:hAnsi="Noto Sans CJK SC" w:eastAsia="Noto Sans CJK SC"/>
+                <w:b w:val="0"/>
                 <w:sz w:val="20"/>
               </w:rPr>
               <w:t>对口资金</w:t>
@@ -839,7 +896,8 @@
           <w:p>
             <w:r>
               <w:rPr>
-                <w:rFonts w:ascii="SimSun" w:hAnsi="SimSun" w:eastAsia="SimSun"/>
+                <w:rFonts w:ascii="Noto Sans CJK SC" w:hAnsi="Noto Sans CJK SC" w:eastAsia="Noto Sans CJK SC"/>
+                <w:b w:val="0"/>
                 <w:sz w:val="20"/>
               </w:rPr>
               <w:t>中等不满意 ⚠️</w:t>
@@ -854,6 +912,9 @@
         <w:pStyle w:val="Heading2"/>
       </w:pPr>
       <w:r>
+        <w:rPr>
+          <w:rFonts w:ascii="Noto Sans CJK SC" w:hAnsi="Noto Sans CJK SC" w:eastAsia="Noto Sans CJK SC"/>
+        </w:rPr>
         <w:t>四、风险分析</w:t>
       </w:r>
     </w:p>
@@ -862,23 +923,28 @@
         <w:pStyle w:val="Heading3"/>
       </w:pPr>
       <w:r>
+        <w:rPr>
+          <w:rFonts w:ascii="Noto Sans CJK SC" w:hAnsi="Noto Sans CJK SC" w:eastAsia="Noto Sans CJK SC"/>
+        </w:rPr>
         <w:t>1. 财务风险 ⚠️⚠️</w:t>
       </w:r>
     </w:p>
     <w:p>
+      <w:pPr/>
       <w:r>
         <w:rPr>
-          <w:rFonts w:ascii="SimSun" w:hAnsi="SimSun" w:eastAsia="SimSun"/>
+          <w:rFonts w:ascii="Noto Sans CJK SC" w:hAnsi="Noto Sans CJK SC" w:eastAsia="Noto Sans CJK SC"/>
           <w:b w:val="0"/>
           <w:sz w:val="22"/>
         </w:rPr>
-        <w:t>• 已拨付约 US$ 7,000万（截至2026年4月），剩余资金约 US$ 8,300万 需在16个月内执行完毕</w:t>
+        <w:t>• 已拨付约 US$ 7,000万（截至2026年4月），剩余资金约 US$ 8,300万需在16个月内执行完毕</w:t>
       </w:r>
     </w:p>
     <w:p>
+      <w:pPr/>
       <w:r>
         <w:rPr>
-          <w:rFonts w:ascii="SimSun" w:hAnsi="SimSun" w:eastAsia="SimSun"/>
+          <w:rFonts w:ascii="Noto Sans CJK SC" w:hAnsi="Noto Sans CJK SC" w:eastAsia="Noto Sans CJK SC"/>
           <w:b w:val="0"/>
           <w:sz w:val="22"/>
         </w:rPr>
@@ -886,9 +952,10 @@
       </w:r>
     </w:p>
     <w:p>
+      <w:pPr/>
       <w:r>
         <w:rPr>
-          <w:rFonts w:ascii="SimSun" w:hAnsi="SimSun" w:eastAsia="SimSun"/>
+          <w:rFonts w:ascii="Noto Sans CJK SC" w:hAnsi="Noto Sans CJK SC" w:eastAsia="Noto Sans CJK SC"/>
           <w:b w:val="0"/>
           <w:color w:val="C80000"/>
           <w:sz w:val="22"/>
@@ -901,13 +968,17 @@
         <w:pStyle w:val="Heading3"/>
       </w:pPr>
       <w:r>
+        <w:rPr>
+          <w:rFonts w:ascii="Noto Sans CJK SC" w:hAnsi="Noto Sans CJK SC" w:eastAsia="Noto Sans CJK SC"/>
+        </w:rPr>
         <w:t>2. 时间风险 ⚠️⚠️⚠️</w:t>
       </w:r>
     </w:p>
     <w:p>
+      <w:pPr/>
       <w:r>
         <w:rPr>
-          <w:rFonts w:ascii="SimSun" w:hAnsi="SimSun" w:eastAsia="SimSun"/>
+          <w:rFonts w:ascii="Noto Sans CJK SC" w:hAnsi="Noto Sans CJK SC" w:eastAsia="Noto Sans CJK SC"/>
           <w:b w:val="0"/>
           <w:sz w:val="22"/>
         </w:rPr>
@@ -915,9 +986,10 @@
       </w:r>
     </w:p>
     <w:p>
+      <w:pPr/>
       <w:r>
         <w:rPr>
-          <w:rFonts w:ascii="SimSun" w:hAnsi="SimSun" w:eastAsia="SimSun"/>
+          <w:rFonts w:ascii="Noto Sans CJK SC" w:hAnsi="Noto Sans CJK SC" w:eastAsia="Noto Sans CJK SC"/>
           <w:b w:val="0"/>
           <w:sz w:val="22"/>
         </w:rPr>
@@ -925,28 +997,21 @@
       </w:r>
     </w:p>
     <w:p>
-      <w:r>
-        <w:rPr>
-          <w:rFonts w:ascii="SimSun" w:hAnsi="SimSun" w:eastAsia="SimSun"/>
-          <w:b w:val="0"/>
-          <w:color w:val="C80000"/>
-          <w:sz w:val="22"/>
-        </w:rPr>
-        <w:t>• 世行项目通常允许6个月的展期，但仍需快速推进</w:t>
-      </w:r>
-    </w:p>
-    <w:p>
       <w:pPr>
         <w:pStyle w:val="Heading3"/>
       </w:pPr>
       <w:r>
+        <w:rPr>
+          <w:rFonts w:ascii="Noto Sans CJK SC" w:hAnsi="Noto Sans CJK SC" w:eastAsia="Noto Sans CJK SC"/>
+        </w:rPr>
         <w:t>3. 执行风险 ⚠️⚠️</w:t>
       </w:r>
     </w:p>
     <w:p>
+      <w:pPr/>
       <w:r>
         <w:rPr>
-          <w:rFonts w:ascii="SimSun" w:hAnsi="SimSun" w:eastAsia="SimSun"/>
+          <w:rFonts w:ascii="Noto Sans CJK SC" w:hAnsi="Noto Sans CJK SC" w:eastAsia="Noto Sans CJK SC"/>
           <w:b w:val="0"/>
           <w:sz w:val="22"/>
         </w:rPr>
@@ -954,9 +1019,10 @@
       </w:r>
     </w:p>
     <w:p>
+      <w:pPr/>
       <w:r>
         <w:rPr>
-          <w:rFonts w:ascii="SimSun" w:hAnsi="SimSun" w:eastAsia="SimSun"/>
+          <w:rFonts w:ascii="Noto Sans CJK SC" w:hAnsi="Noto Sans CJK SC" w:eastAsia="Noto Sans CJK SC"/>
           <w:b w:val="0"/>
           <w:sz w:val="22"/>
         </w:rPr>
@@ -964,9 +1030,10 @@
       </w:r>
     </w:p>
     <w:p>
+      <w:pPr/>
       <w:r>
         <w:rPr>
-          <w:rFonts w:ascii="SimSun" w:hAnsi="SimSun" w:eastAsia="SimSun"/>
+          <w:rFonts w:ascii="Noto Sans CJK SC" w:hAnsi="Noto Sans CJK SC" w:eastAsia="Noto Sans CJK SC"/>
           <w:b w:val="0"/>
           <w:sz w:val="22"/>
         </w:rPr>
@@ -978,13 +1045,17 @@
         <w:pStyle w:val="Heading3"/>
       </w:pPr>
       <w:r>
+        <w:rPr>
+          <w:rFonts w:ascii="Noto Sans CJK SC" w:hAnsi="Noto Sans CJK SC" w:eastAsia="Noto Sans CJK SC"/>
+        </w:rPr>
         <w:t>4. 政治/制度风险 ⚠️</w:t>
       </w:r>
     </w:p>
     <w:p>
+      <w:pPr/>
       <w:r>
         <w:rPr>
-          <w:rFonts w:ascii="SimSun" w:hAnsi="SimSun" w:eastAsia="SimSun"/>
+          <w:rFonts w:ascii="Noto Sans CJK SC" w:hAnsi="Noto Sans CJK SC" w:eastAsia="Noto Sans CJK SC"/>
           <w:b w:val="0"/>
           <w:sz w:val="22"/>
         </w:rPr>
@@ -992,9 +1063,10 @@
       </w:r>
     </w:p>
     <w:p>
+      <w:pPr/>
       <w:r>
         <w:rPr>
-          <w:rFonts w:ascii="SimSun" w:hAnsi="SimSun" w:eastAsia="SimSun"/>
+          <w:rFonts w:ascii="Noto Sans CJK SC" w:hAnsi="Noto Sans CJK SC" w:eastAsia="Noto Sans CJK SC"/>
           <w:b w:val="0"/>
           <w:sz w:val="22"/>
         </w:rPr>
@@ -1006,13 +1078,17 @@
         <w:pStyle w:val="Heading3"/>
       </w:pPr>
       <w:r>
+        <w:rPr>
+          <w:rFonts w:ascii="Noto Sans CJK SC" w:hAnsi="Noto Sans CJK SC" w:eastAsia="Noto Sans CJK SC"/>
+        </w:rPr>
         <w:t>5. 竞争风险 ⚠️</w:t>
       </w:r>
     </w:p>
     <w:p>
+      <w:pPr/>
       <w:r>
         <w:rPr>
-          <w:rFonts w:ascii="SimSun" w:hAnsi="SimSun" w:eastAsia="SimSun"/>
+          <w:rFonts w:ascii="Noto Sans CJK SC" w:hAnsi="Noto Sans CJK SC" w:eastAsia="Noto Sans CJK SC"/>
           <w:b w:val="0"/>
           <w:sz w:val="22"/>
         </w:rPr>
@@ -1020,9 +1096,10 @@
       </w:r>
     </w:p>
     <w:p>
+      <w:pPr/>
       <w:r>
         <w:rPr>
-          <w:rFonts w:ascii="SimSun" w:hAnsi="SimSun" w:eastAsia="SimSun"/>
+          <w:rFonts w:ascii="Noto Sans CJK SC" w:hAnsi="Noto Sans CJK SC" w:eastAsia="Noto Sans CJK SC"/>
           <w:b w:val="0"/>
           <w:sz w:val="22"/>
         </w:rPr>
@@ -1034,6 +1111,9 @@
         <w:pStyle w:val="Heading2"/>
       </w:pPr>
       <w:r>
+        <w:rPr>
+          <w:rFonts w:ascii="Noto Sans CJK SC" w:hAnsi="Noto Sans CJK SC" w:eastAsia="Noto Sans CJK SC"/>
+        </w:rPr>
         <w:t>五、投标要点建议</w:t>
       </w:r>
     </w:p>
@@ -1042,13 +1122,17 @@
         <w:pStyle w:val="Heading3"/>
       </w:pPr>
       <w:r>
+        <w:rPr>
+          <w:rFonts w:ascii="Noto Sans CJK SC" w:hAnsi="Noto Sans CJK SC" w:eastAsia="Noto Sans CJK SC"/>
+        </w:rPr>
         <w:t>资质要求（预估）</w:t>
       </w:r>
     </w:p>
     <w:p>
+      <w:pPr/>
       <w:r>
         <w:rPr>
-          <w:rFonts w:ascii="SimSun" w:hAnsi="SimSun" w:eastAsia="SimSun"/>
+          <w:rFonts w:ascii="Noto Sans CJK SC" w:hAnsi="Noto Sans CJK SC" w:eastAsia="Noto Sans CJK SC"/>
           <w:b w:val="0"/>
           <w:sz w:val="22"/>
         </w:rPr>
@@ -1056,9 +1140,10 @@
       </w:r>
     </w:p>
     <w:p>
+      <w:pPr/>
       <w:r>
         <w:rPr>
-          <w:rFonts w:ascii="SimSun" w:hAnsi="SimSun" w:eastAsia="SimSun"/>
+          <w:rFonts w:ascii="Noto Sans CJK SC" w:hAnsi="Noto Sans CJK SC" w:eastAsia="Noto Sans CJK SC"/>
           <w:b w:val="0"/>
           <w:sz w:val="22"/>
         </w:rPr>
@@ -1066,9 +1151,10 @@
       </w:r>
     </w:p>
     <w:p>
+      <w:pPr/>
       <w:r>
         <w:rPr>
-          <w:rFonts w:ascii="SimSun" w:hAnsi="SimSun" w:eastAsia="SimSun"/>
+          <w:rFonts w:ascii="Noto Sans CJK SC" w:hAnsi="Noto Sans CJK SC" w:eastAsia="Noto Sans CJK SC"/>
           <w:b w:val="0"/>
           <w:sz w:val="22"/>
         </w:rPr>
@@ -1076,9 +1162,10 @@
       </w:r>
     </w:p>
     <w:p>
+      <w:pPr/>
       <w:r>
         <w:rPr>
-          <w:rFonts w:ascii="SimSun" w:hAnsi="SimSun" w:eastAsia="SimSun"/>
+          <w:rFonts w:ascii="Noto Sans CJK SC" w:hAnsi="Noto Sans CJK SC" w:eastAsia="Noto Sans CJK SC"/>
           <w:b w:val="0"/>
           <w:sz w:val="22"/>
         </w:rPr>
@@ -1090,13 +1177,17 @@
         <w:pStyle w:val="Heading3"/>
       </w:pPr>
       <w:r>
+        <w:rPr>
+          <w:rFonts w:ascii="Noto Sans CJK SC" w:hAnsi="Noto Sans CJK SC" w:eastAsia="Noto Sans CJK SC"/>
+        </w:rPr>
         <w:t>关键技术方案</w:t>
       </w:r>
     </w:p>
     <w:p>
+      <w:pPr/>
       <w:r>
         <w:rPr>
-          <w:rFonts w:ascii="SimSun" w:hAnsi="SimSun" w:eastAsia="SimSun"/>
+          <w:rFonts w:ascii="Noto Sans CJK SC" w:hAnsi="Noto Sans CJK SC" w:eastAsia="Noto Sans CJK SC"/>
           <w:b w:val="0"/>
           <w:sz w:val="22"/>
         </w:rPr>
@@ -1104,9 +1195,10 @@
       </w:r>
     </w:p>
     <w:p>
+      <w:pPr/>
       <w:r>
         <w:rPr>
-          <w:rFonts w:ascii="SimSun" w:hAnsi="SimSun" w:eastAsia="SimSun"/>
+          <w:rFonts w:ascii="Noto Sans CJK SC" w:hAnsi="Noto Sans CJK SC" w:eastAsia="Noto Sans CJK SC"/>
           <w:b w:val="0"/>
           <w:sz w:val="22"/>
         </w:rPr>
@@ -1114,9 +1206,10 @@
       </w:r>
     </w:p>
     <w:p>
+      <w:pPr/>
       <w:r>
         <w:rPr>
-          <w:rFonts w:ascii="SimSun" w:hAnsi="SimSun" w:eastAsia="SimSun"/>
+          <w:rFonts w:ascii="Noto Sans CJK SC" w:hAnsi="Noto Sans CJK SC" w:eastAsia="Noto Sans CJK SC"/>
           <w:b w:val="0"/>
           <w:sz w:val="22"/>
         </w:rPr>
@@ -1124,9 +1217,10 @@
       </w:r>
     </w:p>
     <w:p>
+      <w:pPr/>
       <w:r>
         <w:rPr>
-          <w:rFonts w:ascii="SimSun" w:hAnsi="SimSun" w:eastAsia="SimSun"/>
+          <w:rFonts w:ascii="Noto Sans CJK SC" w:hAnsi="Noto Sans CJK SC" w:eastAsia="Noto Sans CJK SC"/>
           <w:b w:val="0"/>
           <w:sz w:val="22"/>
         </w:rPr>
@@ -1138,6 +1232,9 @@
         <w:pStyle w:val="Heading3"/>
       </w:pPr>
       <w:r>
+        <w:rPr>
+          <w:rFonts w:ascii="Noto Sans CJK SC" w:hAnsi="Noto Sans CJK SC" w:eastAsia="Noto Sans CJK SC"/>
+        </w:rPr>
         <w:t>投标策略</w:t>
       </w:r>
     </w:p>
@@ -1160,7 +1257,7 @@
           <w:p>
             <w:r>
               <w:rPr>
-                <w:rFonts w:ascii="SimSun" w:hAnsi="SimSun" w:eastAsia="SimSun"/>
+                <w:rFonts w:ascii="Noto Sans CJK SC" w:hAnsi="Noto Sans CJK SC" w:eastAsia="Noto Sans CJK SC"/>
                 <w:b/>
                 <w:sz w:val="20"/>
               </w:rPr>
@@ -1175,7 +1272,7 @@
           <w:p>
             <w:r>
               <w:rPr>
-                <w:rFonts w:ascii="SimSun" w:hAnsi="SimSun" w:eastAsia="SimSun"/>
+                <w:rFonts w:ascii="Noto Sans CJK SC" w:hAnsi="Noto Sans CJK SC" w:eastAsia="Noto Sans CJK SC"/>
                 <w:b/>
                 <w:sz w:val="20"/>
               </w:rPr>
@@ -1192,7 +1289,8 @@
           <w:p>
             <w:r>
               <w:rPr>
-                <w:rFonts w:ascii="SimSun" w:hAnsi="SimSun" w:eastAsia="SimSun"/>
+                <w:rFonts w:ascii="Noto Sans CJK SC" w:hAnsi="Noto Sans CJK SC" w:eastAsia="Noto Sans CJK SC"/>
+                <w:b w:val="0"/>
                 <w:sz w:val="20"/>
               </w:rPr>
               <w:t>合作模式</w:t>
@@ -1206,7 +1304,8 @@
           <w:p>
             <w:r>
               <w:rPr>
-                <w:rFonts w:ascii="SimSun" w:hAnsi="SimSun" w:eastAsia="SimSun"/>
+                <w:rFonts w:ascii="Noto Sans CJK SC" w:hAnsi="Noto Sans CJK SC" w:eastAsia="Noto Sans CJK SC"/>
+                <w:b w:val="0"/>
                 <w:sz w:val="20"/>
               </w:rPr>
               <w:t>推荐与巴西本地建筑公司组成联合体（JV）</w:t>
@@ -1222,7 +1321,8 @@
           <w:p>
             <w:r>
               <w:rPr>
-                <w:rFonts w:ascii="SimSun" w:hAnsi="SimSun" w:eastAsia="SimSun"/>
+                <w:rFonts w:ascii="Noto Sans CJK SC" w:hAnsi="Noto Sans CJK SC" w:eastAsia="Noto Sans CJK SC"/>
+                <w:b w:val="0"/>
                 <w:sz w:val="20"/>
               </w:rPr>
               <w:t>技术差异化</w:t>
@@ -1236,7 +1336,8 @@
           <w:p>
             <w:r>
               <w:rPr>
-                <w:rFonts w:ascii="SimSun" w:hAnsi="SimSun" w:eastAsia="SimSun"/>
+                <w:rFonts w:ascii="Noto Sans CJK SC" w:hAnsi="Noto Sans CJK SC" w:eastAsia="Noto Sans CJK SC"/>
+                <w:b w:val="0"/>
                 <w:sz w:val="20"/>
               </w:rPr>
               <w:t>强调气候适应性供水方案、节水技术</w:t>
@@ -1252,7 +1353,8 @@
           <w:p>
             <w:r>
               <w:rPr>
-                <w:rFonts w:ascii="SimSun" w:hAnsi="SimSun" w:eastAsia="SimSun"/>
+                <w:rFonts w:ascii="Noto Sans CJK SC" w:hAnsi="Noto Sans CJK SC" w:eastAsia="Noto Sans CJK SC"/>
+                <w:b w:val="0"/>
                 <w:sz w:val="20"/>
               </w:rPr>
               <w:t>价格策略</w:t>
@@ -1266,7 +1368,8 @@
           <w:p>
             <w:r>
               <w:rPr>
-                <w:rFonts w:ascii="SimSun" w:hAnsi="SimSun" w:eastAsia="SimSun"/>
+                <w:rFonts w:ascii="Noto Sans CJK SC" w:hAnsi="Noto Sans CJK SC" w:eastAsia="Noto Sans CJK SC"/>
+                <w:b w:val="0"/>
                 <w:sz w:val="20"/>
               </w:rPr>
               <w:t>中低价位 + 强调全生命周期成本优势</w:t>
@@ -1282,7 +1385,8 @@
           <w:p>
             <w:r>
               <w:rPr>
-                <w:rFonts w:ascii="SimSun" w:hAnsi="SimSun" w:eastAsia="SimSun"/>
+                <w:rFonts w:ascii="Noto Sans CJK SC" w:hAnsi="Noto Sans CJK SC" w:eastAsia="Noto Sans CJK SC"/>
+                <w:b w:val="0"/>
                 <w:sz w:val="20"/>
               </w:rPr>
               <w:t>社会价值</w:t>
@@ -1296,7 +1400,8 @@
           <w:p>
             <w:r>
               <w:rPr>
-                <w:rFonts w:ascii="SimSun" w:hAnsi="SimSun" w:eastAsia="SimSun"/>
+                <w:rFonts w:ascii="Noto Sans CJK SC" w:hAnsi="Noto Sans CJK SC" w:eastAsia="Noto Sans CJK SC"/>
+                <w:b w:val="0"/>
                 <w:sz w:val="20"/>
               </w:rPr>
               <w:t>突出社区参与和培训方案（世行重视）</w:t>
@@ -1311,6 +1416,9 @@
         <w:pStyle w:val="Heading2"/>
       </w:pPr>
       <w:r>
+        <w:rPr>
+          <w:rFonts w:ascii="Noto Sans CJK SC" w:hAnsi="Noto Sans CJK SC" w:eastAsia="Noto Sans CJK SC"/>
+        </w:rPr>
         <w:t>六、项目执行计划建议</w:t>
       </w:r>
     </w:p>
@@ -1319,46 +1427,26 @@
         <w:pStyle w:val="Heading3"/>
       </w:pPr>
       <w:r>
+        <w:rPr>
+          <w:rFonts w:ascii="Noto Sans CJK SC" w:hAnsi="Noto Sans CJK SC" w:eastAsia="Noto Sans CJK SC"/>
+        </w:rPr>
         <w:t>第一阶段：启动期（前2个月）</w:t>
       </w:r>
     </w:p>
     <w:p>
+      <w:pPr/>
       <w:r>
         <w:rPr>
-          <w:rFonts w:ascii="SimSun" w:hAnsi="SimSun" w:eastAsia="SimSun"/>
+          <w:rFonts w:ascii="Noto Sans CJK SC" w:hAnsi="Noto Sans CJK SC" w:eastAsia="Noto Sans CJK SC"/>
           <w:b w:val="0"/>
           <w:sz w:val="22"/>
         </w:rPr>
         <w:t>• 签订合同 + 动员</w:t>
-      </w:r>
-    </w:p>
-    <w:p>
-      <w:r>
-        <w:rPr>
-          <w:rFonts w:ascii="SimSun" w:hAnsi="SimSun" w:eastAsia="SimSun"/>
-          <w:b w:val="0"/>
-          <w:sz w:val="22"/>
-        </w:rPr>
+        <w:br/>
         <w:t>• 组建项目团队（含本地分包商选定）</w:t>
-      </w:r>
-    </w:p>
-    <w:p>
-      <w:r>
-        <w:rPr>
-          <w:rFonts w:ascii="SimSun" w:hAnsi="SimSun" w:eastAsia="SimSun"/>
-          <w:b w:val="0"/>
-          <w:sz w:val="22"/>
-        </w:rPr>
+        <w:br/>
         <w:t>• 施工图深化设计</w:t>
-      </w:r>
-    </w:p>
-    <w:p>
-      <w:r>
-        <w:rPr>
-          <w:rFonts w:ascii="SimSun" w:hAnsi="SimSun" w:eastAsia="SimSun"/>
-          <w:b w:val="0"/>
-          <w:sz w:val="22"/>
-        </w:rPr>
+        <w:br/>
         <w:t>• 社区参与启动</w:t>
       </w:r>
     </w:p>
@@ -1367,56 +1455,28 @@
         <w:pStyle w:val="Heading3"/>
       </w:pPr>
       <w:r>
+        <w:rPr>
+          <w:rFonts w:ascii="Noto Sans CJK SC" w:hAnsi="Noto Sans CJK SC" w:eastAsia="Noto Sans CJK SC"/>
+        </w:rPr>
         <w:t>第二阶段：施工期（8个月）</w:t>
       </w:r>
     </w:p>
     <w:p>
+      <w:pPr/>
       <w:r>
         <w:rPr>
-          <w:rFonts w:ascii="SimSun" w:hAnsi="SimSun" w:eastAsia="SimSun"/>
+          <w:rFonts w:ascii="Noto Sans CJK SC" w:hAnsi="Noto Sans CJK SC" w:eastAsia="Noto Sans CJK SC"/>
           <w:b w:val="0"/>
           <w:sz w:val="22"/>
         </w:rPr>
         <w:t>• 水井钻探/水源工程</w:t>
-      </w:r>
-    </w:p>
-    <w:p>
-      <w:r>
-        <w:rPr>
-          <w:rFonts w:ascii="SimSun" w:hAnsi="SimSun" w:eastAsia="SimSun"/>
-          <w:b w:val="0"/>
-          <w:sz w:val="22"/>
-        </w:rPr>
+        <w:br/>
         <w:t>• 管网铺设</w:t>
-      </w:r>
-    </w:p>
-    <w:p>
-      <w:r>
-        <w:rPr>
-          <w:rFonts w:ascii="SimSun" w:hAnsi="SimSun" w:eastAsia="SimSun"/>
-          <w:b w:val="0"/>
-          <w:sz w:val="22"/>
-        </w:rPr>
+        <w:br/>
         <w:t>• 储水设施建设</w:t>
-      </w:r>
-    </w:p>
-    <w:p>
-      <w:r>
-        <w:rPr>
-          <w:rFonts w:ascii="SimSun" w:hAnsi="SimSun" w:eastAsia="SimSun"/>
-          <w:b w:val="0"/>
-          <w:sz w:val="22"/>
-        </w:rPr>
+        <w:br/>
         <w:t>• 卫生模块施工</w:t>
-      </w:r>
-    </w:p>
-    <w:p>
-      <w:r>
-        <w:rPr>
-          <w:rFonts w:ascii="SimSun" w:hAnsi="SimSun" w:eastAsia="SimSun"/>
-          <w:b w:val="0"/>
-          <w:sz w:val="22"/>
-        </w:rPr>
+        <w:br/>
         <w:t>• 平行施工（多个村落同时开展）</w:t>
       </w:r>
     </w:p>
@@ -1425,46 +1485,26 @@
         <w:pStyle w:val="Heading3"/>
       </w:pPr>
       <w:r>
+        <w:rPr>
+          <w:rFonts w:ascii="Noto Sans CJK SC" w:hAnsi="Noto Sans CJK SC" w:eastAsia="Noto Sans CJK SC"/>
+        </w:rPr>
         <w:t>第三阶段：收尾（第11-13个月）</w:t>
       </w:r>
     </w:p>
     <w:p>
+      <w:pPr/>
       <w:r>
         <w:rPr>
-          <w:rFonts w:ascii="SimSun" w:hAnsi="SimSun" w:eastAsia="SimSun"/>
+          <w:rFonts w:ascii="Noto Sans CJK SC" w:hAnsi="Noto Sans CJK SC" w:eastAsia="Noto Sans CJK SC"/>
           <w:b w:val="0"/>
           <w:sz w:val="22"/>
         </w:rPr>
         <w:t>• 系统调试</w:t>
-      </w:r>
-    </w:p>
-    <w:p>
-      <w:r>
-        <w:rPr>
-          <w:rFonts w:ascii="SimSun" w:hAnsi="SimSun" w:eastAsia="SimSun"/>
-          <w:b w:val="0"/>
-          <w:sz w:val="22"/>
-        </w:rPr>
+        <w:br/>
         <w:t>• 社区培训 + 运维移交</w:t>
-      </w:r>
-    </w:p>
-    <w:p>
-      <w:r>
-        <w:rPr>
-          <w:rFonts w:ascii="SimSun" w:hAnsi="SimSun" w:eastAsia="SimSun"/>
-          <w:b w:val="0"/>
-          <w:sz w:val="22"/>
-        </w:rPr>
+        <w:br/>
         <w:t>• 竣工资料编制</w:t>
-      </w:r>
-    </w:p>
-    <w:p>
-      <w:r>
-        <w:rPr>
-          <w:rFonts w:ascii="SimSun" w:hAnsi="SimSun" w:eastAsia="SimSun"/>
-          <w:b w:val="0"/>
-          <w:sz w:val="22"/>
-        </w:rPr>
+        <w:br/>
         <w:t>• 缺陷责任期维护</w:t>
       </w:r>
     </w:p>
@@ -1473,36 +1513,24 @@
         <w:pStyle w:val="Heading3"/>
       </w:pPr>
       <w:r>
+        <w:rPr>
+          <w:rFonts w:ascii="Noto Sans CJK SC" w:hAnsi="Noto Sans CJK SC" w:eastAsia="Noto Sans CJK SC"/>
+        </w:rPr>
         <w:t>第四阶段：质保期（12个月）</w:t>
       </w:r>
     </w:p>
     <w:p>
+      <w:pPr/>
       <w:r>
         <w:rPr>
-          <w:rFonts w:ascii="SimSun" w:hAnsi="SimSun" w:eastAsia="SimSun"/>
+          <w:rFonts w:ascii="Noto Sans CJK SC" w:hAnsi="Noto Sans CJK SC" w:eastAsia="Noto Sans CJK SC"/>
           <w:b w:val="0"/>
           <w:sz w:val="22"/>
         </w:rPr>
         <w:t>• 系统运行监测</w:t>
-      </w:r>
-    </w:p>
-    <w:p>
-      <w:r>
-        <w:rPr>
-          <w:rFonts w:ascii="SimSun" w:hAnsi="SimSun" w:eastAsia="SimSun"/>
-          <w:b w:val="0"/>
-          <w:sz w:val="22"/>
-        </w:rPr>
+        <w:br/>
         <w:t>• 问题整改</w:t>
-      </w:r>
-    </w:p>
-    <w:p>
-      <w:r>
-        <w:rPr>
-          <w:rFonts w:ascii="SimSun" w:hAnsi="SimSun" w:eastAsia="SimSun"/>
-          <w:b w:val="0"/>
-          <w:sz w:val="22"/>
-        </w:rPr>
+        <w:br/>
         <w:t>• 最终验收</w:t>
       </w:r>
     </w:p>
@@ -1511,13 +1539,17 @@
         <w:pStyle w:val="Heading2"/>
       </w:pPr>
       <w:r>
+        <w:rPr>
+          <w:rFonts w:ascii="Noto Sans CJK SC" w:hAnsi="Noto Sans CJK SC" w:eastAsia="Noto Sans CJK SC"/>
+        </w:rPr>
         <w:t>七、项目优势</w:t>
       </w:r>
     </w:p>
     <w:p>
+      <w:pPr/>
       <w:r>
         <w:rPr>
-          <w:rFonts w:ascii="SimSun" w:hAnsi="SimSun" w:eastAsia="SimSun"/>
+          <w:rFonts w:ascii="Noto Sans CJK SC" w:hAnsi="Noto Sans CJK SC" w:eastAsia="Noto Sans CJK SC"/>
           <w:b w:val="0"/>
           <w:sz w:val="22"/>
         </w:rPr>
@@ -1525,9 +1557,10 @@
       </w:r>
     </w:p>
     <w:p>
+      <w:pPr/>
       <w:r>
         <w:rPr>
-          <w:rFonts w:ascii="SimSun" w:hAnsi="SimSun" w:eastAsia="SimSun"/>
+          <w:rFonts w:ascii="Noto Sans CJK SC" w:hAnsi="Noto Sans CJK SC" w:eastAsia="Noto Sans CJK SC"/>
           <w:b w:val="0"/>
           <w:sz w:val="22"/>
         </w:rPr>
@@ -1535,9 +1568,10 @@
       </w:r>
     </w:p>
     <w:p>
+      <w:pPr/>
       <w:r>
         <w:rPr>
-          <w:rFonts w:ascii="SimSun" w:hAnsi="SimSun" w:eastAsia="SimSun"/>
+          <w:rFonts w:ascii="Noto Sans CJK SC" w:hAnsi="Noto Sans CJK SC" w:eastAsia="Noto Sans CJK SC"/>
           <w:b w:val="0"/>
           <w:sz w:val="22"/>
         </w:rPr>
@@ -1545,9 +1579,10 @@
       </w:r>
     </w:p>
     <w:p>
+      <w:pPr/>
       <w:r>
         <w:rPr>
-          <w:rFonts w:ascii="SimSun" w:hAnsi="SimSun" w:eastAsia="SimSun"/>
+          <w:rFonts w:ascii="Noto Sans CJK SC" w:hAnsi="Noto Sans CJK SC" w:eastAsia="Noto Sans CJK SC"/>
           <w:b w:val="0"/>
           <w:sz w:val="22"/>
         </w:rPr>
@@ -1555,13 +1590,14 @@
       </w:r>
     </w:p>
     <w:p>
+      <w:pPr/>
       <w:r>
         <w:rPr>
-          <w:rFonts w:ascii="SimSun" w:hAnsi="SimSun" w:eastAsia="SimSun"/>
+          <w:rFonts w:ascii="Noto Sans CJK SC" w:hAnsi="Noto Sans CJK SC" w:eastAsia="Noto Sans CJK SC"/>
           <w:b w:val="0"/>
           <w:sz w:val="22"/>
         </w:rPr>
-        <w:t>5. 总预算大（US$1.5亿+） → 后续还有更多分包机会</w:t>
+        <w:t>5. 总预算大（US$1.5亿+）→ 后续还有更多分包机会</w:t>
       </w:r>
     </w:p>
     <w:p>
@@ -1569,6 +1605,9 @@
         <w:pStyle w:val="Heading2"/>
       </w:pPr>
       <w:r>
+        <w:rPr>
+          <w:rFonts w:ascii="Noto Sans CJK SC" w:hAnsi="Noto Sans CJK SC" w:eastAsia="Noto Sans CJK SC"/>
+        </w:rPr>
         <w:t>八、行动建议</w:t>
       </w:r>
     </w:p>
@@ -1592,7 +1631,7 @@
           <w:p>
             <w:r>
               <w:rPr>
-                <w:rFonts w:ascii="SimSun" w:hAnsi="SimSun" w:eastAsia="SimSun"/>
+                <w:rFonts w:ascii="Noto Sans CJK SC" w:hAnsi="Noto Sans CJK SC" w:eastAsia="Noto Sans CJK SC"/>
                 <w:b/>
                 <w:sz w:val="20"/>
               </w:rPr>
@@ -1607,7 +1646,7 @@
           <w:p>
             <w:r>
               <w:rPr>
-                <w:rFonts w:ascii="SimSun" w:hAnsi="SimSun" w:eastAsia="SimSun"/>
+                <w:rFonts w:ascii="Noto Sans CJK SC" w:hAnsi="Noto Sans CJK SC" w:eastAsia="Noto Sans CJK SC"/>
                 <w:b/>
                 <w:sz w:val="20"/>
               </w:rPr>
@@ -1622,7 +1661,7 @@
           <w:p>
             <w:r>
               <w:rPr>
-                <w:rFonts w:ascii="SimSun" w:hAnsi="SimSun" w:eastAsia="SimSun"/>
+                <w:rFonts w:ascii="Noto Sans CJK SC" w:hAnsi="Noto Sans CJK SC" w:eastAsia="Noto Sans CJK SC"/>
                 <w:b/>
                 <w:sz w:val="20"/>
               </w:rPr>
@@ -1639,10 +1678,11 @@
           <w:p>
             <w:r>
               <w:rPr>
-                <w:rFonts w:ascii="SimSun" w:hAnsi="SimSun" w:eastAsia="SimSun"/>
+                <w:rFonts w:ascii="Noto Sans CJK SC" w:hAnsi="Noto Sans CJK SC" w:eastAsia="Noto Sans CJK SC"/>
+                <w:b w:val="0"/>
                 <w:sz w:val="20"/>
               </w:rPr>
-              <w:t>🔴 高</w:t>
+              <w:t>高</w:t>
             </w:r>
           </w:p>
         </w:tc>
@@ -1653,7 +1693,8 @@
           <w:p>
             <w:r>
               <w:rPr>
-                <w:rFonts w:ascii="SimSun" w:hAnsi="SimSun" w:eastAsia="SimSun"/>
+                <w:rFonts w:ascii="Noto Sans CJK SC" w:hAnsi="Noto Sans CJK SC" w:eastAsia="Noto Sans CJK SC"/>
+                <w:b w:val="0"/>
                 <w:sz w:val="20"/>
               </w:rPr>
               <w:t>尽快</w:t>
@@ -1667,7 +1708,8 @@
           <w:p>
             <w:r>
               <w:rPr>
-                <w:rFonts w:ascii="SimSun" w:hAnsi="SimSun" w:eastAsia="SimSun"/>
+                <w:rFonts w:ascii="Noto Sans CJK SC" w:hAnsi="Noto Sans CJK SC" w:eastAsia="Noto Sans CJK SC"/>
+                <w:b w:val="0"/>
                 <w:sz w:val="20"/>
               </w:rPr>
               <w:t>确认是否参与 → 获取完整招标文件并翻译</w:t>
@@ -1683,10 +1725,11 @@
           <w:p>
             <w:r>
               <w:rPr>
-                <w:rFonts w:ascii="SimSun" w:hAnsi="SimSun" w:eastAsia="SimSun"/>
+                <w:rFonts w:ascii="Noto Sans CJK SC" w:hAnsi="Noto Sans CJK SC" w:eastAsia="Noto Sans CJK SC"/>
+                <w:b w:val="0"/>
                 <w:sz w:val="20"/>
               </w:rPr>
-              <w:t>🔴 高</w:t>
+              <w:t>高</w:t>
             </w:r>
           </w:p>
         </w:tc>
@@ -1697,7 +1740,8 @@
           <w:p>
             <w:r>
               <w:rPr>
-                <w:rFonts w:ascii="SimSun" w:hAnsi="SimSun" w:eastAsia="SimSun"/>
+                <w:rFonts w:ascii="Noto Sans CJK SC" w:hAnsi="Noto Sans CJK SC" w:eastAsia="Noto Sans CJK SC"/>
+                <w:b w:val="0"/>
                 <w:sz w:val="20"/>
               </w:rPr>
               <w:t>近期</w:t>
@@ -1711,7 +1755,8 @@
           <w:p>
             <w:r>
               <w:rPr>
-                <w:rFonts w:ascii="SimSun" w:hAnsi="SimSun" w:eastAsia="SimSun"/>
+                <w:rFonts w:ascii="Noto Sans CJK SC" w:hAnsi="Noto Sans CJK SC" w:eastAsia="Noto Sans CJK SC"/>
+                <w:b w:val="0"/>
                 <w:sz w:val="20"/>
               </w:rPr>
               <w:t>寻找巴西本地建筑合作伙伴（联合体）</w:t>
@@ -1727,10 +1772,11 @@
           <w:p>
             <w:r>
               <w:rPr>
-                <w:rFonts w:ascii="SimSun" w:hAnsi="SimSun" w:eastAsia="SimSun"/>
+                <w:rFonts w:ascii="Noto Sans CJK SC" w:hAnsi="Noto Sans CJK SC" w:eastAsia="Noto Sans CJK SC"/>
+                <w:b w:val="0"/>
                 <w:sz w:val="20"/>
               </w:rPr>
-              <w:t>🟡 中</w:t>
+              <w:t>中</w:t>
             </w:r>
           </w:p>
         </w:tc>
@@ -1741,7 +1787,8 @@
           <w:p>
             <w:r>
               <w:rPr>
-                <w:rFonts w:ascii="SimSun" w:hAnsi="SimSun" w:eastAsia="SimSun"/>
+                <w:rFonts w:ascii="Noto Sans CJK SC" w:hAnsi="Noto Sans CJK SC" w:eastAsia="Noto Sans CJK SC"/>
+                <w:b w:val="0"/>
                 <w:sz w:val="20"/>
               </w:rPr>
               <w:t>投标前</w:t>
@@ -1755,7 +1802,8 @@
           <w:p>
             <w:r>
               <w:rPr>
-                <w:rFonts w:ascii="SimSun" w:hAnsi="SimSun" w:eastAsia="SimSun"/>
+                <w:rFonts w:ascii="Noto Sans CJK SC" w:hAnsi="Noto Sans CJK SC" w:eastAsia="Noto Sans CJK SC"/>
+                <w:b w:val="0"/>
                 <w:sz w:val="20"/>
               </w:rPr>
               <w:t>准备葡萄牙语资质文件</w:t>
@@ -1771,10 +1819,11 @@
           <w:p>
             <w:r>
               <w:rPr>
-                <w:rFonts w:ascii="SimSun" w:hAnsi="SimSun" w:eastAsia="SimSun"/>
+                <w:rFonts w:ascii="Noto Sans CJK SC" w:hAnsi="Noto Sans CJK SC" w:eastAsia="Noto Sans CJK SC"/>
+                <w:b w:val="0"/>
                 <w:sz w:val="20"/>
               </w:rPr>
-              <w:t>🟡 中</w:t>
+              <w:t>中</w:t>
             </w:r>
           </w:p>
         </w:tc>
@@ -1785,7 +1834,8 @@
           <w:p>
             <w:r>
               <w:rPr>
-                <w:rFonts w:ascii="SimSun" w:hAnsi="SimSun" w:eastAsia="SimSun"/>
+                <w:rFonts w:ascii="Noto Sans CJK SC" w:hAnsi="Noto Sans CJK SC" w:eastAsia="Noto Sans CJK SC"/>
+                <w:b w:val="0"/>
                 <w:sz w:val="20"/>
               </w:rPr>
               <w:t>投标前</w:t>
@@ -1799,7 +1849,8 @@
           <w:p>
             <w:r>
               <w:rPr>
-                <w:rFonts w:ascii="SimSun" w:hAnsi="SimSun" w:eastAsia="SimSun"/>
+                <w:rFonts w:ascii="Noto Sans CJK SC" w:hAnsi="Noto Sans CJK SC" w:eastAsia="Noto Sans CJK SC"/>
+                <w:b w:val="0"/>
                 <w:sz w:val="20"/>
               </w:rPr>
               <w:t>差旅塞阿拉州现场踏勘</w:t>
@@ -1815,10 +1866,11 @@
           <w:p>
             <w:r>
               <w:rPr>
-                <w:rFonts w:ascii="SimSun" w:hAnsi="SimSun" w:eastAsia="SimSun"/>
+                <w:rFonts w:ascii="Noto Sans CJK SC" w:hAnsi="Noto Sans CJK SC" w:eastAsia="Noto Sans CJK SC"/>
+                <w:b w:val="0"/>
                 <w:sz w:val="20"/>
               </w:rPr>
-              <w:t>🟢 低</w:t>
+              <w:t>低</w:t>
             </w:r>
           </w:p>
         </w:tc>
@@ -1829,7 +1881,8 @@
           <w:p>
             <w:r>
               <w:rPr>
-                <w:rFonts w:ascii="SimSun" w:hAnsi="SimSun" w:eastAsia="SimSun"/>
+                <w:rFonts w:ascii="Noto Sans CJK SC" w:hAnsi="Noto Sans CJK SC" w:eastAsia="Noto Sans CJK SC"/>
+                <w:b w:val="0"/>
                 <w:sz w:val="20"/>
               </w:rPr>
               <w:t>长期</w:t>
@@ -1843,7 +1896,8 @@
           <w:p>
             <w:r>
               <w:rPr>
-                <w:rFonts w:ascii="SimSun" w:hAnsi="SimSun" w:eastAsia="SimSun"/>
+                <w:rFonts w:ascii="Noto Sans CJK SC" w:hAnsi="Noto Sans CJK SC" w:eastAsia="Noto Sans CJK SC"/>
+                <w:b w:val="0"/>
                 <w:sz w:val="20"/>
               </w:rPr>
               <w:t>关注该项目的其他采购公告（光伏、培训等）</w:t>
@@ -1853,16 +1907,16 @@
       </w:tr>
     </w:tbl>
     <w:p/>
-    <w:p/>
     <w:p>
+      <w:pPr/>
       <w:r>
         <w:rPr>
-          <w:rFonts w:ascii="SimSun" w:hAnsi="SimSun" w:eastAsia="SimSun"/>
+          <w:rFonts w:ascii="Noto Sans CJK SC" w:hAnsi="Noto Sans CJK SC" w:eastAsia="Noto Sans CJK SC"/>
           <w:b w:val="0"/>
           <w:color w:val="808080"/>
           <w:sz w:val="18"/>
         </w:rPr>
-        <w:t>⚠️ 免责声明：以上分析基于公开可获取的世行项目信息。实际投标请以完整招标文件（RFP/Bidding Document）为准。建议在决定参与前获取全套招标文件并咨询巴西当地法律/税务顾问。</w:t>
+        <w:t>⚠️ 免责声明：以上分析基于公开可获取的世行项目信息。实际投标请以完整招标文件为准。建议在决定参与前获取全套招标文件并咨询巴西当地法律/税务顾问。</w:t>
       </w:r>
     </w:p>
     <w:sectPr>
@@ -2239,7 +2293,7 @@
     <w:qFormat/>
     <w:rsid w:val="00FC693F"/>
     <w:rPr>
-      <w:rFonts w:ascii="SimSun" w:hAnsi="SimSun" w:eastAsia="SimSun"/>
+      <w:rFonts w:ascii="Noto Sans CJK SC" w:hAnsi="Noto Sans CJK SC" w:eastAsia="Noto Sans CJK SC"/>
       <w:sz w:val="22"/>
     </w:rPr>
   </w:style>
@@ -2302,11 +2356,11 @@
       <w:outlineLvl w:val="0"/>
     </w:pPr>
     <w:rPr>
-      <w:rFonts w:asciiTheme="majorHAnsi" w:eastAsiaTheme="majorEastAsia" w:hAnsiTheme="majorHAnsi" w:cstheme="majorBidi" w:ascii="SimHei" w:hAnsi="SimHei" w:eastAsia="SimHei"/>
+      <w:rFonts w:asciiTheme="majorHAnsi" w:eastAsiaTheme="majorEastAsia" w:hAnsiTheme="majorHAnsi" w:cstheme="majorBidi"/>
       <w:b/>
       <w:bCs/>
-      <w:color w:val="000000"/>
-      <w:sz w:val="36"/>
+      <w:color w:val="365F91" w:themeColor="accent1" w:themeShade="BF"/>
+      <w:sz w:val="28"/>
       <w:szCs w:val="28"/>
     </w:rPr>
   </w:style>
@@ -2326,11 +2380,11 @@
       <w:outlineLvl w:val="1"/>
     </w:pPr>
     <w:rPr>
-      <w:rFonts w:asciiTheme="majorHAnsi" w:eastAsiaTheme="majorEastAsia" w:hAnsiTheme="majorHAnsi" w:cstheme="majorBidi" w:ascii="SimHei" w:hAnsi="SimHei" w:eastAsia="SimHei"/>
+      <w:rFonts w:asciiTheme="majorHAnsi" w:eastAsiaTheme="majorEastAsia" w:hAnsiTheme="majorHAnsi" w:cstheme="majorBidi"/>
       <w:b/>
       <w:bCs/>
-      <w:color w:val="000000"/>
-      <w:sz w:val="28"/>
+      <w:color w:val="4F81BD" w:themeColor="accent1"/>
+      <w:sz w:val="26"/>
       <w:szCs w:val="26"/>
     </w:rPr>
   </w:style>
@@ -2350,11 +2404,10 @@
       <w:outlineLvl w:val="2"/>
     </w:pPr>
     <w:rPr>
-      <w:rFonts w:asciiTheme="majorHAnsi" w:eastAsiaTheme="majorEastAsia" w:hAnsiTheme="majorHAnsi" w:cstheme="majorBidi" w:ascii="SimHei" w:hAnsi="SimHei" w:eastAsia="SimHei"/>
+      <w:rFonts w:asciiTheme="majorHAnsi" w:eastAsiaTheme="majorEastAsia" w:hAnsiTheme="majorHAnsi" w:cstheme="majorBidi"/>
       <w:b/>
       <w:bCs/>
-      <w:color w:val="000000"/>
-      <w:sz w:val="24"/>
+      <w:color w:val="4F81BD" w:themeColor="accent1"/>
     </w:rPr>
   </w:style>
   <w:style w:type="paragraph" w:styleId="Heading4">

</xml_diff>